<commit_message>
fix(auth): implement dual persistence for user credentials to prevent reset on redeploy and add password visibility toggle (Phase 7)
</commit_message>
<xml_diff>
--- a/docs/人行環境WebGIS平台_架構建置與除錯指南.docx
+++ b/docs/人行環境WebGIS平台_架構建置與除錯指南.docx
@@ -117,7 +117,7 @@
           <w:color w:val="334155"/>
           <w:sz w:val="21"/>
         </w:rPr>
-        <w:t>本系統之研發歷經六大核心里程碑，從模型確立到巨量圖資串流、安全防護與行動端無遮擋互動：</w:t>
+        <w:t>本系統之研發歷經七大核心里程碑，從模型確立到巨量圖資串流、安全防護、行動端無遮擋互動與雲端持久化：</w:t>
       </w:r>
     </w:p>
     <w:p>
@@ -369,6 +369,39 @@
           <w:sz w:val="21"/>
         </w:rPr>
         <w:t>針對現場踏勘同仁在智慧型手機與平板電腦上的操作需求，進行架構級響應式重構。貫徹「以不影響圖面操作為最大原則」，在行動觸控模式下徹底取消了地圖中央的 Pop up 氣泡跳出，改由下方卡片顯示屬性並以 easeTo 視角偏移避免遮擋；直式支援三段吸附式 Bottom Sheet (Peek / Half / Full)，橫式自動切換為緊湊邊欄 (Side Dock)，保障 70% 以上完整水平畫布。</w:t>
+      </w:r>
+    </w:p>
+    <w:p>
+      <w:pPr>
+        <w:pStyle w:val="Heading2"/>
+        <w:keepNext/>
+        <w:spacing w:before="280" w:after="120"/>
+      </w:pPr>
+      <w:r>
+        <w:rPr>
+          <w:rFonts w:ascii="微軟正黑體" w:hAnsi="微軟正黑體"/>
+          <w:b/>
+          <w:color w:val="0F172A"/>
+          <w:sz w:val="27"/>
+        </w:rPr>
+        <w:t>1.7 Phase 7：雲端部署帳密持久化防重置機制與密碼可見性控制</w:t>
+      </w:r>
+    </w:p>
+    <w:p>
+      <w:pPr>
+        <w:spacing w:before="0" w:after="120" w:line="300" w:lineRule="auto"/>
+      </w:pPr>
+      <w:r>
+        <w:rPr>
+          <w:rFonts w:ascii="微軟正黑體" w:hAnsi="微軟正黑體"/>
+          <w:color w:val="334155"/>
+          <w:sz w:val="21"/>
+        </w:rPr>
+        <w:t>【痛點排查與創新解決】先前系統在每次程式碼更新或雲端重新部署後，帳號密碼都會被重置回預設值。經查核心原因為：(1) .gitignore 忽略了 *.db 導致 server/admin.db 未納入 Git 版本控管；(2) 雲端容器（如 Render）於重新構建時啟動乾淨映像檔，init_db() 偵測資料庫為空便自動重建預設管理員。</w:t>
+        <w:br/>
+        <w:t>為此我們設計了「SQLite + users_seed.json 雙軌持久化同步架構」：後端在每次新增、刪除帳號或修改密碼時自動導出 users_seed.json；當容器重新部署資料庫為空時，init_db() 優先從種子檔完整還原所有帳號與密碼雜湊，徹底消除重置風險。同時在 .gitignore 白名單放行 !server/admin.db 與 !server/users_seed.json。</w:t>
+        <w:br/>
+        <w:t>此外，於系統登入、新增使用者與密碼變更輸入框配置一鍵切換眼睛按鈕 (👁️ / 🙈)，支援密碼明文/掩碼切換，提供優質的觸控無障礙體驗。</w:t>
       </w:r>
     </w:p>
     <w:p>
@@ -1987,7 +2020,7 @@
                 <w:color w:val="1E293B"/>
                 <w:sz w:val="18"/>
               </w:rPr>
-              <w:t>SQLite (WAL 模式) + PBKDF2</w:t>
+              <w:t>SQLite (WAL) + PBKDF2 + users_seed.json 雙軌持久化</w:t>
             </w:r>
           </w:p>
         </w:tc>
@@ -2012,7 +2045,7 @@
                 <w:color w:val="1E293B"/>
                 <w:sz w:val="18"/>
               </w:rPr>
-              <w:t>單檔資料庫，無連線池洩漏風險，隨代碼一同備份；具備銀行級隨機鹽值與 10 萬次雜湊疊代強度。</w:t>
+              <w:t>單檔零配置，隨代碼備份；PBKDF2 隨機鹽值 10 萬次雜湊；搭配自動 JSON 種子檔同步與重啟還原，徹底解決雲端重新部署帳密重置問題。</w:t>
             </w:r>
           </w:p>
         </w:tc>
@@ -3061,6 +3094,21 @@
               <w:t>5. 導覽列精簡：行動端頂部簡化為搜尋快捷鈕，觸控點擊區間維持 42px 以上。</w:t>
               <w:br/>
               <w:br/>
+              <w:t>## 5. 帳號密碼持久化與密碼顯示切換防護</w:t>
+              <w:br/>
+              <w:t>1. 帳號雙軌持久化：</w:t>
+              <w:br/>
+              <w:t xml:space="preserve">   - 後端使用 SQLite 資料庫，每次新增/刪除帳號或修改密碼時，自動序列化導出 server/users_seed.json。</w:t>
+              <w:br/>
+              <w:t xml:space="preserve">   - init_db() 初始化時若偵測資料表為空（雲端容器重新建置拉取乾淨環境），優先從 users_seed.json 完整還原所有同仁帳號與密碼雜湊，杜絕部署後帳密重置。</w:t>
+              <w:br/>
+              <w:t xml:space="preserve">   - .gitignore 白名單放行 !server/admin.db 與 !server/users_seed.json。</w:t>
+              <w:br/>
+              <w:t>2. 密碼輸入可見性切換：</w:t>
+              <w:br/>
+              <w:t xml:space="preserve">   - 所有密碼輸入框均配置眼睛切換按鈕 (👁️ / 🙈)，支援一鍵切換 password 與 text 類型，並具備優良的觸控無障礙點擊體驗。</w:t>
+              <w:br/>
+              <w:br/>
               <w:t>請依此規範生成完整專案結構、設定檔與源代碼。</w:t>
             </w:r>
           </w:p>

</xml_diff>

<commit_message>
feat: convert 12M+ road walkability score to positive citizen-centric rating and align A-E grade standard
</commit_message>
<xml_diff>
--- a/docs/人行環境WebGIS平台_架構建置與除錯指南.docx
+++ b/docs/人行環境WebGIS平台_架構建置與除錯指南.docx
@@ -117,7 +117,7 @@
           <w:color w:val="334155"/>
           <w:sz w:val="21"/>
         </w:rPr>
-        <w:t>本系統之研發歷經七大核心里程碑，從模型確立到巨量圖資串流、安全防護、行動端無遮擋互動與雲端持久化：</w:t>
+        <w:t>本系統之研發歷經八大核心里程碑，從模型確立到巨量圖資串流、安全防護、行動端無遮擋互動、雲端持久化與道路評估改制大眾正面評分：</w:t>
       </w:r>
     </w:p>
     <w:p>
@@ -402,6 +402,37 @@
         <w:t>為此我們設計了「SQLite + users_seed.json 雙軌持久化同步架構」：後端在每次新增、刪除帳號或修改密碼時自動導出 users_seed.json；當容器重新部署資料庫為空時，init_db() 優先從種子檔完整還原所有帳號與密碼雜湊，徹底消除重置風險。同時在 .gitignore 白名單放行 !server/admin.db 與 !server/users_seed.json。</w:t>
         <w:br/>
         <w:t>此外，於系統登入、新增使用者與密碼變更輸入框配置一鍵切換眼睛按鈕 (👁️ / 🙈)，支援密碼明文/掩碼切換，提供優質的觸控無障礙體驗。</w:t>
+      </w:r>
+    </w:p>
+    <w:p>
+      <w:pPr>
+        <w:pStyle w:val="Heading2"/>
+        <w:keepNext/>
+        <w:spacing w:before="280" w:after="120"/>
+      </w:pPr>
+      <w:r>
+        <w:rPr>
+          <w:rFonts w:ascii="微軟正黑體" w:hAnsi="微軟正黑體"/>
+          <w:b/>
+          <w:color w:val="0F172A"/>
+          <w:sz w:val="27"/>
+        </w:rPr>
+        <w:t>1.8 Phase 8：道路評估改制大眾正面評分（100 - I_TOTAL）與五級分制對齊</w:t>
+      </w:r>
+    </w:p>
+    <w:p>
+      <w:pPr>
+        <w:spacing w:before="0" w:after="120" w:line="300" w:lineRule="auto"/>
+      </w:pPr>
+      <w:r>
+        <w:rPr>
+          <w:rFonts w:ascii="微軟正黑體" w:hAnsi="微軟正黑體"/>
+          <w:color w:val="334155"/>
+          <w:sz w:val="21"/>
+        </w:rPr>
+        <w:t>【痛點與業務優化】先前 12 公尺以上道路改善評估採用工務局急迫扣分制（I_TOTAL，分數越高代表路況越差、越急迫，70~86 分為最劣 Tier 1 紅色）。市民在點擊檢視時常產生「86分很高為什麼是紅色糟糕路段」的認知衝突，且與生活圈分析採用的國土署 2.0 V2 正向五級分制（A~E 級）脫鉤。</w:t>
+        <w:br/>
+        <w:t>為此系統全面實施「雙軌呈現與正面評分換算」：(1) 正面分數換算公式為 WalkScore = max(0, min(100, round(100 - I_TOTAL, 1)))，將 16~86 分的急迫扣分轉為 14~84 分的直觀步行優良度總分；(2) 統一五級分制對照（A級≥80優良、B級65~79良好、C級50~64普通、D級35~49待改善、E級&lt;35亟待改善）；(3) 地圖 Pop up 與右側屬性抽屜第一視覺放大呈現正面評分與等級徽章，次要區塊完整保留工務改善優先度（Tier 1~4）與全市名次，兼顧市民通俗理解與工程單位查閱；(4) 左側圖例面板同步增設 12M+ 道路步行良好度五級圖例，地圖線條色彩意涵一目了然。</w:t>
       </w:r>
     </w:p>
     <w:p>

</xml_diff>

<commit_message>
fix: eliminate false base scores on water and non-pedestrian zones with guardrail detection
</commit_message>
<xml_diff>
--- a/docs/人行環境WebGIS平台_架構建置與除錯指南.docx
+++ b/docs/人行環境WebGIS平台_架構建置與除錯指南.docx
@@ -433,6 +433,39 @@
         <w:t>【痛點與業務優化】先前 12 公尺以上道路改善評估採用工務局急迫扣分制（I_TOTAL，分數越高代表路況越差、越急迫，70~86 分為最劣 Tier 1 紅色）。市民在點擊檢視時常產生「86分很高為什麼是紅色糟糕路段」的認知衝突，且與生活圈分析採用的國土署 2.0 V2 正向五級分制（A~E 級）脫鉤。</w:t>
         <w:br/>
         <w:t>為此系統全面實施「雙軌呈現與正面評分換算」：(1) 正面分數換算公式為 WalkScore = max(0, min(100, round(100 - I_TOTAL, 1)))，將 16~86 分的急迫扣分轉為 14~84 分的直觀步行優良度總分；(2) 統一五級分制對照（A級≥80優良、B級65~79良好、C級50~64普通、D級35~49待改善、E級&lt;35亟待改善）；(3) 地圖 Pop up 與右側屬性抽屜第一視覺放大呈現正面評分與等級徽章，次要區塊完整保留工務改善優先度（Tier 1~4）與全市名次，兼顧市民通俗理解與工程單位查閱；(4) 左側圖例面板同步增設 12M+ 道路步行良好度五級圖例，地圖線條色彩意涵一目了然。</w:t>
+      </w:r>
+    </w:p>
+    <w:p>
+      <w:pPr>
+        <w:pStyle w:val="Heading2"/>
+        <w:keepNext/>
+        <w:spacing w:before="280" w:after="120"/>
+      </w:pPr>
+      <w:r>
+        <w:rPr>
+          <w:rFonts w:ascii="微軟正黑體" w:hAnsi="微軟正黑體"/>
+          <w:b/>
+          <w:color w:val="0F172A"/>
+          <w:sz w:val="27"/>
+        </w:rPr>
+        <w:t>1.9 Phase 9：水域與非人行區域防呆判定機制與零基礎分規範</w:t>
+      </w:r>
+    </w:p>
+    <w:p>
+      <w:pPr>
+        <w:spacing w:before="0" w:after="120" w:line="300" w:lineRule="auto"/>
+      </w:pPr>
+      <w:r>
+        <w:rPr>
+          <w:rFonts w:ascii="微軟正黑體" w:hAnsi="微軟正黑體"/>
+          <w:color w:val="334155"/>
+          <w:sz w:val="21"/>
+        </w:rPr>
+        <w:t>【痛點與業務防呆】主管實測回報：「在湖泊水域（如澄清湖、蓮池潭）或無路荒地中間框選時，湖面居然能拿到 28~35 分基礎分，交通安全甚至拿到 100 分滿分！」</w:t>
+        <w:br/>
+        <w:t>經深查底層代碼，根本成因在於：(1) 早期演算法給予步行分數 weighted_walk_score = 40 保底分（加權 45% 貢獻 18 分）；(2) 交通安全指數採「100 - 事故扣分」計算，水域中央從無人車通行因此 0 事故，反被系統判定為 100 分滿分安全（加權 10% 貢獻 10 分），合計白白給出 28 分虛假基礎分。</w:t>
+        <w:br/>
+        <w:t>為此系統建立嚴密防呆機制：(1) 若所選區域無 12m 道路 (total_clipped_len == 0)、無實體人行道 (sw_len == 0)、無 POI 生活設施且無事故紀錄，系統即刻判定為「非人行評估範圍 (水域/未開闢區)」；(2) is_evaluable 設為 False，所有分數強制歸零，等級標註為「不適用 (非人行評估範圍)」；(3) 抽屜儀表板總分顯示「-- / 100 分 (不適用)」，並插入友善警示條告知水域不發放基礎分，成果圖匯出亦同步標註不適用，徹底解決水面獲分荒謬現象。</w:t>
       </w:r>
     </w:p>
     <w:p>

</xml_diff>

<commit_message>
feat: reject spatial analysis when no road or sidewalk data in area
</commit_message>
<xml_diff>
--- a/docs/人行環境WebGIS平台_架構建置與除錯指南.docx
+++ b/docs/人行環境WebGIS平台_架構建置與除錯指南.docx
@@ -117,7 +117,7 @@
           <w:color w:val="334155"/>
           <w:sz w:val="21"/>
         </w:rPr>
-        <w:t>本系統之研發歷經八大核心里程碑，從模型確立到巨量圖資串流、安全防護、行動端無遮擋互動、雲端持久化與道路評估改制大眾正面評分：</w:t>
+        <w:t>本系統之研發歷經九大核心里程碑，從空間模型確立到巨量圖資串流、安全防護、行動端無遮擋互動、雲端持久化、道路改制大眾正面評分與無道路資料前置防呆攔截：</w:t>
       </w:r>
     </w:p>
     <w:p>
@@ -448,7 +448,7 @@
           <w:color w:val="0F172A"/>
           <w:sz w:val="27"/>
         </w:rPr>
-        <w:t>1.9 Phase 9：水域與非人行區域防呆判定機制與零基礎分規範</w:t>
+        <w:t>1.9 Phase 9：無道路資料前置攔截與防呆不予分析機制 (No Road Guardrail)</w:t>
       </w:r>
     </w:p>
     <w:p>
@@ -461,11 +461,11 @@
           <w:color w:val="334155"/>
           <w:sz w:val="21"/>
         </w:rPr>
-        <w:t>【痛點與業務防呆】主管實測回報：「在湖泊水域（如澄清湖、蓮池潭）或無路荒地中間框選時，湖面居然能拿到 28~35 分基礎分，交通安全甚至拿到 100 分滿分！」</w:t>
+        <w:t>【痛點與業務防呆】主管實測回報：「在湖泊水域或空地中手繪框選一小塊範圍，也能計算出 28 分左右的基礎分，交通安全甚至拿到 100 分滿分！」</w:t>
         <w:br/>
-        <w:t>經深查底層代碼，根本成因在於：(1) 早期演算法給予步行分數 weighted_walk_score = 40 保底分（加權 45% 貢獻 18 分）；(2) 交通安全指數採「100 - 事故扣分」計算，水域中央從無人車通行因此 0 事故，反被系統判定為 100 分滿分安全（加權 10% 貢獻 10 分），合計白白給出 28 分虛假基礎分。</w:t>
+        <w:t>經深查後端空間演算法，根本成因在於：(1) 早期演算法給予步行分數 weighted_walk_score = 40 保底分（加權 45% 貢獻 18 分）；(2) 交通安全指數採「100 - 事故扣分」計算，無道路處無事故，被系統判定為 100 分滿分安全（加權 10% 貢獻 10 分），兩者相加產生 28 分虛假基礎分。</w:t>
         <w:br/>
-        <w:t>為此系統建立嚴密防呆機制：(1) 若所選區域無 12m 道路 (total_clipped_len == 0)、無實體人行道 (sw_len == 0)、無 POI 生活設施且無事故紀錄，系統即刻判定為「非人行評估範圍 (水域/未開闢區)」；(2) is_evaluable 設為 False，所有分數強制歸零，等級標註為「不適用 (非人行評估範圍)」；(3) 抽屜儀表板總分顯示「-- / 100 分 (不適用)」，並插入友善警示條告知水域不發放基礎分，成果圖匯出亦同步標註不適用，徹底解決水面獲分荒謬現象。</w:t>
+        <w:t>為此系統確立「框選分析範圍內沒有道路則不予分析」防呆原則：(1) 後端 perform_spatial_analysis 空間剪裁前置利用 R-tree 空間索引快速檢核 road_priority 與 sidewalk，若所選範圍內兩者幾何長度均為 0，立即返回 valid: false 與 HTTP 400，明確標註「範圍內無道路與人行道資料，不予分析」；(2) 前端即時阻擋，彈出一致提示「範圍內無道路與人行道資料，不予分析」，並自動關閉 loading 遮罩與收合右側抽屜，杜絕產生任何評估卡片或基礎分數；(3) 提示文案純粹客觀，嚴禁出現「水域」或「無人行設施」等揣測字眼，維持公部門嚴謹規格。</w:t>
       </w:r>
     </w:p>
     <w:p>

</xml_diff>